<commit_message>
Rewrite README for web workflow
</commit_message>
<xml_diff>
--- a/README.docx
+++ b/README.docx
@@ -7,7 +7,7 @@
         <w:pStyle w:val="Heading1"/>
       </w:pPr>
       <w:r>
-        <w:t>Claude export dialogue pipeline</w:t>
+        <w:t>Claude Export Dialogue Tools</w:t>
       </w:r>
     </w:p>
     <w:p>
@@ -20,7 +20,7 @@
         <w:spacing w:after="80"/>
       </w:pPr>
       <w:r>
-        <w:t>把 Claude export zip 转成 dialogue-folder 工作区。</w:t>
+        <w:t>把 Claude 导出的 zip，在浏览器里复核项目归属，并导出成 dialogue-folder 文件夹。</w:t>
       </w:r>
     </w:p>
     <w:p>
@@ -33,7 +33,7 @@
         <w:pStyle w:val="Heading2"/>
       </w:pPr>
       <w:r>
-        <w:t>Usage</w:t>
+        <w:t>Files</w:t>
       </w:r>
     </w:p>
     <w:p>
@@ -46,7 +46,118 @@
         <w:spacing w:after="80"/>
       </w:pPr>
       <w:r>
-        <w:t>在桌面创建一个文件夹，命名为 `claude备份`。</w:t>
+        <w:t>你只需要这几个文件：</w:t>
+      </w:r>
+    </w:p>
+    <w:p>
+      <w:pPr>
+        <w:spacing w:after="80"/>
+      </w:pPr>
+    </w:p>
+    <w:p>
+      <w:pPr>
+        <w:pStyle w:val="ListBullet"/>
+      </w:pPr>
+      <w:r>
+        <w:t>`classification-reviewer.html`：网页版复核和导出工具。</w:t>
+      </w:r>
+    </w:p>
+    <w:p>
+      <w:pPr>
+        <w:pStyle w:val="ListBullet"/>
+      </w:pPr>
+      <w:r>
+        <w:t>`restored.py`：命令行备用脚本。</w:t>
+      </w:r>
+    </w:p>
+    <w:p>
+      <w:pPr>
+        <w:pStyle w:val="ListBullet"/>
+      </w:pPr>
+      <w:r>
+        <w:t>`README.md` / `README.docx`：使用说明。</w:t>
+      </w:r>
+    </w:p>
+    <w:p>
+      <w:pPr>
+        <w:pStyle w:val="ListBullet"/>
+      </w:pPr>
+      <w:r>
+        <w:t>`claude-export.zip`：你从 Claude 导出的数据包，不要上传到 GitHub。</w:t>
+      </w:r>
+    </w:p>
+    <w:p>
+      <w:pPr>
+        <w:spacing w:after="80"/>
+      </w:pPr>
+    </w:p>
+    <w:p>
+      <w:pPr>
+        <w:pStyle w:val="Heading2"/>
+      </w:pPr>
+      <w:r>
+        <w:t>Web Usage</w:t>
+      </w:r>
+    </w:p>
+    <w:p>
+      <w:pPr>
+        <w:spacing w:after="80"/>
+      </w:pPr>
+    </w:p>
+    <w:p>
+      <w:pPr>
+        <w:pStyle w:val="ListNumber"/>
+      </w:pPr>
+      <w:r>
+        <w:t>把 `classification-reviewer.html` 和 `claude-export.zip` 放在同一个文件夹里。</w:t>
+      </w:r>
+    </w:p>
+    <w:p>
+      <w:pPr>
+        <w:pStyle w:val="ListNumber"/>
+      </w:pPr>
+      <w:r>
+        <w:t>双击打开 `classification-reviewer.html`。</w:t>
+      </w:r>
+    </w:p>
+    <w:p>
+      <w:pPr>
+        <w:pStyle w:val="ListNumber"/>
+      </w:pPr>
+      <w:r>
+        <w:t>拖入或选择 `claude-export.zip`。</w:t>
+      </w:r>
+    </w:p>
+    <w:p>
+      <w:pPr>
+        <w:pStyle w:val="ListNumber"/>
+      </w:pPr>
+      <w:r>
+        <w:t>在左侧选择项目，中间选择对话，右侧查看内容。</w:t>
+      </w:r>
+    </w:p>
+    <w:p>
+      <w:pPr>
+        <w:pStyle w:val="ListNumber"/>
+      </w:pPr>
+      <w:r>
+        <w:t>如果对话归属不对，在右侧下拉框改到正确项目，点击保存归属。</w:t>
+      </w:r>
+    </w:p>
+    <w:p>
+      <w:pPr>
+        <w:pStyle w:val="ListNumber"/>
+      </w:pPr>
+      <w:r>
+        <w:t>点击 `以文件夹的形式导出`。</w:t>
+      </w:r>
+    </w:p>
+    <w:p>
+      <w:pPr>
+        <w:pStyle w:val="ListNumber"/>
+      </w:pPr>
+      <w:r>
+        <w:t>选择保存位置，页面会生成一个 `restored-时间戳/` 文件夹。</w:t>
       </w:r>
     </w:p>
     <w:p>
@@ -59,7 +170,7 @@
         <w:spacing w:after="80"/>
       </w:pPr>
       <w:r>
-        <w:t>把这些文件放进 `claude备份`：</w:t>
+        <w:t>所有读取、复核和导出都在本地浏览器完成，不需要上传 Claude 数据。</w:t>
       </w:r>
     </w:p>
     <w:p>
@@ -69,26 +180,10 @@
     </w:p>
     <w:p>
       <w:pPr>
-        <w:pStyle w:val="ListBullet"/>
+        <w:pStyle w:val="Heading2"/>
       </w:pPr>
       <w:r>
-        <w:t>`restored.py`</w:t>
-      </w:r>
-    </w:p>
-    <w:p>
-      <w:pPr>
-        <w:pStyle w:val="ListBullet"/>
-      </w:pPr>
-      <w:r>
-        <w:t>`classification-reviewer.html`</w:t>
-      </w:r>
-    </w:p>
-    <w:p>
-      <w:pPr>
-        <w:pStyle w:val="ListBullet"/>
-      </w:pPr>
-      <w:r>
-        <w:t>`claude-export.zip`，也就是从 Claude 获取到的数据压缩包，请重命名成这个名字</w:t>
+        <w:t>Web Output</w:t>
       </w:r>
     </w:p>
     <w:p>
@@ -101,57 +196,7 @@
         <w:spacing w:after="80"/>
       </w:pPr>
       <w:r>
-        <w:t>如果你想先人工复核项目归属并直接导出文件夹：</w:t>
-      </w:r>
-    </w:p>
-    <w:p>
-      <w:pPr>
-        <w:spacing w:after="80"/>
-      </w:pPr>
-    </w:p>
-    <w:p>
-      <w:pPr>
-        <w:spacing w:after="80"/>
-      </w:pPr>
-      <w:r>
-        <w:t>1. 双击打开 `classification-reviewer.html`。</w:t>
-      </w:r>
-    </w:p>
-    <w:p>
-      <w:pPr>
-        <w:spacing w:after="80"/>
-      </w:pPr>
-      <w:r>
-        <w:t>2. 拖入 `claude-export.zip`。</w:t>
-      </w:r>
-    </w:p>
-    <w:p>
-      <w:pPr>
-        <w:spacing w:after="80"/>
-      </w:pPr>
-      <w:r>
-        <w:t>3. 在页面里调整错分的对话。</w:t>
-      </w:r>
-    </w:p>
-    <w:p>
-      <w:pPr>
-        <w:spacing w:after="80"/>
-      </w:pPr>
-      <w:r>
-        <w:t>4. 点击 `以文件夹的形式导出`，选择保存位置。</w:t>
-      </w:r>
-    </w:p>
-    <w:p>
-      <w:pPr>
-        <w:spacing w:after="80"/>
-      </w:pPr>
-    </w:p>
-    <w:p>
-      <w:pPr>
-        <w:spacing w:after="80"/>
-      </w:pPr>
-      <w:r>
-        <w:t>打开终端，运行：</w:t>
+        <w:t>导出的文件夹大致是：</w:t>
       </w:r>
     </w:p>
     <w:p>
@@ -165,77 +210,7 @@
           <w:rFonts w:ascii="Menlo" w:hAnsi="Menlo"/>
           <w:sz w:val="18"/>
         </w:rPr>
-        <w:t>cd ~/Desktop/claude备份</w:t>
-      </w:r>
-    </w:p>
-    <w:p>
-      <w:r>
-        <w:rPr>
-          <w:rFonts w:ascii="Menlo" w:hAnsi="Menlo"/>
-          <w:sz w:val="18"/>
-        </w:rPr>
-        <w:t>python3 restored.py claude-export.zip --output restored --work-dir work --force</w:t>
-      </w:r>
-    </w:p>
-    <w:p>
-      <w:pPr>
-        <w:spacing w:after="80"/>
-      </w:pPr>
-    </w:p>
-    <w:p>
-      <w:pPr>
-        <w:spacing w:after="80"/>
-      </w:pPr>
-      <w:r>
-        <w:t>运行后结果在 `restored/`。</w:t>
-      </w:r>
-    </w:p>
-    <w:p>
-      <w:pPr>
-        <w:spacing w:after="80"/>
-      </w:pPr>
-      <w:r>
-        <w:t>`work/` 是临时处理目录，运行成功后会自动删除。</w:t>
-      </w:r>
-    </w:p>
-    <w:p>
-      <w:pPr>
-        <w:spacing w:after="80"/>
-      </w:pPr>
-    </w:p>
-    <w:p>
-      <w:pPr>
-        <w:spacing w:after="80"/>
-      </w:pPr>
-      <w:r>
-        <w:t>脚本固定生成的结构名使用英文；从 Claude 导出内容转译出来的项目名、对话名、资料名会保留原文。</w:t>
-      </w:r>
-    </w:p>
-    <w:p>
-      <w:pPr>
-        <w:spacing w:after="80"/>
-      </w:pPr>
-    </w:p>
-    <w:p>
-      <w:pPr>
-        <w:pStyle w:val="Heading2"/>
-      </w:pPr>
-      <w:r>
-        <w:t>Output layout</w:t>
-      </w:r>
-    </w:p>
-    <w:p>
-      <w:pPr>
-        <w:spacing w:after="80"/>
-      </w:pPr>
-    </w:p>
-    <w:p>
-      <w:r>
-        <w:rPr>
-          <w:rFonts w:ascii="Menlo" w:hAnsi="Menlo"/>
-          <w:sz w:val="18"/>
-        </w:rPr>
-        <w:t>restored/</w:t>
+        <w:t>restored-时间戳/</w:t>
       </w:r>
     </w:p>
     <w:p>
@@ -353,10 +328,144 @@
     </w:p>
     <w:p>
       <w:pPr>
+        <w:spacing w:after="80"/>
+      </w:pPr>
+      <w:r>
+        <w:t>`未分类对话` 会作为一个项目文件夹出现。置信分为 0 的对话不会显示，也不会导出。</w:t>
+      </w:r>
+    </w:p>
+    <w:p>
+      <w:pPr>
+        <w:spacing w:after="80"/>
+      </w:pPr>
+    </w:p>
+    <w:p>
+      <w:pPr>
         <w:pStyle w:val="Heading2"/>
       </w:pPr>
       <w:r>
-        <w:t>Options</w:t>
+        <w:t>Classification Review</w:t>
+      </w:r>
+    </w:p>
+    <w:p>
+      <w:pPr>
+        <w:spacing w:after="80"/>
+      </w:pPr>
+    </w:p>
+    <w:p>
+      <w:pPr>
+        <w:spacing w:after="80"/>
+      </w:pPr>
+      <w:r>
+        <w:t>页面会自动用项目名称、项目记忆、项目资料和对话内容做初步分类。</w:t>
+      </w:r>
+    </w:p>
+    <w:p>
+      <w:pPr>
+        <w:spacing w:after="80"/>
+      </w:pPr>
+    </w:p>
+    <w:p>
+      <w:pPr>
+        <w:spacing w:after="80"/>
+      </w:pPr>
+      <w:r>
+        <w:t>复核时重点看：</w:t>
+      </w:r>
+    </w:p>
+    <w:p>
+      <w:pPr>
+        <w:spacing w:after="80"/>
+      </w:pPr>
+    </w:p>
+    <w:p>
+      <w:pPr>
+        <w:pStyle w:val="ListBullet"/>
+      </w:pPr>
+      <w:r>
+        <w:t>分数低或第一、第二候选接近的对话。</w:t>
+      </w:r>
+    </w:p>
+    <w:p>
+      <w:pPr>
+        <w:pStyle w:val="ListBullet"/>
+      </w:pPr>
+      <w:r>
+        <w:t>被放进 `未分类对话` 的对话。</w:t>
+      </w:r>
+    </w:p>
+    <w:p>
+      <w:pPr>
+        <w:pStyle w:val="ListBullet"/>
+      </w:pPr>
+      <w:r>
+        <w:t>明显属于某个项目、但被分到另一个项目的对话。</w:t>
+      </w:r>
+    </w:p>
+    <w:p>
+      <w:pPr>
+        <w:spacing w:after="80"/>
+      </w:pPr>
+    </w:p>
+    <w:p>
+      <w:pPr>
+        <w:spacing w:after="80"/>
+      </w:pPr>
+      <w:r>
+        <w:t>修改后的项目归属会直接用于 `以文件夹的形式导出`。</w:t>
+      </w:r>
+    </w:p>
+    <w:p>
+      <w:pPr>
+        <w:spacing w:after="80"/>
+      </w:pPr>
+    </w:p>
+    <w:p>
+      <w:pPr>
+        <w:pStyle w:val="Heading2"/>
+      </w:pPr>
+      <w:r>
+        <w:t>Optional CLI</w:t>
+      </w:r>
+    </w:p>
+    <w:p>
+      <w:pPr>
+        <w:spacing w:after="80"/>
+      </w:pPr>
+    </w:p>
+    <w:p>
+      <w:pPr>
+        <w:spacing w:after="80"/>
+      </w:pPr>
+      <w:r>
+        <w:t>如果你不需要网页复核，也可以用脚本直接生成：</w:t>
+      </w:r>
+    </w:p>
+    <w:p>
+      <w:pPr>
+        <w:spacing w:after="80"/>
+      </w:pPr>
+    </w:p>
+    <w:p>
+      <w:r>
+        <w:rPr>
+          <w:rFonts w:ascii="Menlo" w:hAnsi="Menlo"/>
+          <w:sz w:val="18"/>
+        </w:rPr>
+        <w:t>python3 restored.py claude-export.zip --output restored --work-dir work --force</w:t>
+      </w:r>
+    </w:p>
+    <w:p>
+      <w:pPr>
+        <w:spacing w:after="80"/>
+      </w:pPr>
+    </w:p>
+    <w:p>
+      <w:pPr>
+        <w:spacing w:after="80"/>
+      </w:pPr>
+      <w:r>
+        <w:t>常用参数：</w:t>
       </w:r>
     </w:p>
     <w:p>
@@ -430,7 +539,7 @@
         <w:pStyle w:val="Heading2"/>
       </w:pPr>
       <w:r>
-        <w:t>Classification</w:t>
+        <w:t>Privacy</w:t>
       </w:r>
     </w:p>
     <w:p>
@@ -443,47 +552,52 @@
         <w:spacing w:after="80"/>
       </w:pPr>
       <w:r>
-        <w:t>脚本会用项目名称、项目文档、项目记忆匹配对话标题和摘要。</w:t>
+        <w:t>不要提交这些文件或目录到 GitHub：</w:t>
       </w:r>
     </w:p>
     <w:p>
       <w:pPr>
         <w:spacing w:after="80"/>
       </w:pPr>
+    </w:p>
+    <w:p>
+      <w:pPr>
+        <w:pStyle w:val="ListBullet"/>
+      </w:pPr>
       <w:r>
-        <w:t>如果传入手动修正表，手动修正会优先于自动分类。</w:t>
+        <w:t>`claude-export.zip`</w:t>
       </w:r>
     </w:p>
     <w:p>
       <w:pPr>
-        <w:spacing w:after="80"/>
+        <w:pStyle w:val="ListBullet"/>
       </w:pPr>
       <w:r>
-        <w:t>低置信度对话会放入 `projects/未分类对话/`，方便后续人工复核。</w:t>
+        <w:t>`restored/`</w:t>
       </w:r>
     </w:p>
     <w:p>
       <w:pPr>
-        <w:spacing w:after="80"/>
+        <w:pStyle w:val="ListBullet"/>
       </w:pPr>
       <w:r>
-        <w:t>没有标题、摘要、正文或有效附件名的空对话会自动跳过。</w:t>
+        <w:t>`restored-*/`</w:t>
       </w:r>
     </w:p>
     <w:p>
       <w:pPr>
-        <w:spacing w:after="80"/>
+        <w:pStyle w:val="ListBullet"/>
       </w:pPr>
       <w:r>
-        <w:t>对话中带 `extracted_content` 的附件会写入该对话的 `files/`。</w:t>
+        <w:t>`work/`</w:t>
       </w:r>
     </w:p>
     <w:p>
       <w:pPr>
-        <w:spacing w:after="80"/>
+        <w:pStyle w:val="ListBullet"/>
       </w:pPr>
       <w:r>
-        <w:t>没有记忆、资料、描述和有效对话的空项目会自动跳过。</w:t>
+        <w:t>`.claude-export-work/`</w:t>
       </w:r>
     </w:p>
     <w:sectPr>

</xml_diff>